<commit_message>
docs: update weekly reports with Multi-Currency, Email Monthly Reports, and active semester work focus
</commit_message>
<xml_diff>
--- a/Trackify_Weekly_Report_Week_1.docx
+++ b/Trackify_Weekly_Report_Week_1.docx
@@ -328,7 +328,7 @@
                 <w:b/>
                 <w:sz w:val="20"/>
               </w:rPr>
-              <w:t>Module Focus: System Architecture, Authentication Module &amp; Database Schema Definition</w:t>
+              <w:t>Module Focus: Core Authentication Integration, Security PIN Lock &amp; Profile Management</w:t>
               <w:br/>
             </w:r>
           </w:p>
@@ -342,7 +342,7 @@
                 <w:rFonts w:ascii="Arial" w:hAnsi="Arial"/>
                 <w:sz w:val="19"/>
               </w:rPr>
-              <w:t>• Project Architecture &amp; Environment Setup: Configured React 19 + Vite frontend SPA and Node.js + Express backend server with CORS &amp; cookie-parser.</w:t>
+              <w:t>• Authentication Architecture &amp; Security Constraints: Implemented user registration and login endpoints (server/routes/auth.js) with bcryptjs password hashing, JWT session token verification, and password policy constraints (minimum 8 characters, uppercase, lowercase, number, special character).</w:t>
             </w:r>
           </w:p>
           <w:p>
@@ -355,7 +355,7 @@
                 <w:rFonts w:ascii="Arial" w:hAnsi="Arial"/>
                 <w:sz w:val="19"/>
               </w:rPr>
-              <w:t>• Database Schemas Definition: Created Mongoose ODM models for User (auth &amp; profile), Expense (transactions), Budget (category limits), Friend (social), Message (P2P chat), and Group (bill splits).</w:t>
+              <w:t>• Security PIN Protection Layer: Built SetPin.jsx and PinLock.jsx frontend views backed by PIN hashing endpoints to shield sensitive user transaction data.</w:t>
             </w:r>
           </w:p>
           <w:p>
@@ -368,7 +368,7 @@
                 <w:rFonts w:ascii="Arial" w:hAnsi="Arial"/>
                 <w:sz w:val="19"/>
               </w:rPr>
-              <w:t>• User Registration &amp; Login API: Implemented POST /api/auth/register and POST /api/auth/login with password hashing via bcryptjs and 7-day session JWT tokens.</w:t>
+              <w:t>• User Profile Management &amp; Customization: Developed Profile.jsx view allowing users to update personal details, phone number, address, avatar image URL, timezone, and language settings.</w:t>
             </w:r>
           </w:p>
           <w:p>
@@ -381,7 +381,7 @@
                 <w:rFonts w:ascii="Arial" w:hAnsi="Arial"/>
                 <w:sz w:val="19"/>
               </w:rPr>
-              <w:t>• Security PIN Lock &amp; Recovery Flow: Implemented SetPin.jsx, PinLock.jsx views, password constraints validation, and reset password token generation.</w:t>
+              <w:t>• Password Recovery via SMTP: Integrated Nodemailer transport in auth.js sending password reset links to user email accounts.</w:t>
             </w:r>
           </w:p>
           <w:p>
@@ -394,7 +394,7 @@
                 <w:rFonts w:ascii="Arial" w:hAnsi="Arial"/>
                 <w:sz w:val="19"/>
               </w:rPr>
-              <w:t>• Google OAuth Integration: Integrated GoogleOAuthProvider and GoogleLogin component setup for smooth authentication.</w:t>
+              <w:t>• Database Seeding Infrastructure: Developed seed_trackify.js script populating initial user accounts, category budgets, and personal financial ledgers for local testing.</w:t>
             </w:r>
           </w:p>
         </w:tc>
@@ -466,7 +466,7 @@
                 <w:rFonts w:ascii="Arial" w:hAnsi="Arial"/>
                 <w:sz w:val="19"/>
               </w:rPr>
-              <w:t>• Build core personal financial ledger endpoints (Income tracking, Expense management with category filtering).</w:t>
+              <w:t>• Implement personal transaction ledger APIs (Income and Expense tracking with category filtering).</w:t>
             </w:r>
           </w:p>
           <w:p>
@@ -479,7 +479,7 @@
                 <w:rFonts w:ascii="Arial" w:hAnsi="Arial"/>
                 <w:sz w:val="19"/>
               </w:rPr>
-              <w:t>• Implement Category Budget limit configuration and visual progress alert indicators.</w:t>
+              <w:t>• Develop category-based budget limit configuration and spent vs. limit warning alerts.</w:t>
             </w:r>
           </w:p>
           <w:p>
@@ -492,7 +492,7 @@
                 <w:rFonts w:ascii="Arial" w:hAnsi="Arial"/>
                 <w:sz w:val="19"/>
               </w:rPr>
-              <w:t>• Develop Summary Analytics API (GET /summary, GET /monthly, GET /by-category) and frontend chart widgets.</w:t>
+              <w:t>• Build multi-format data export engine supporting PDF, CSV, and JSON report downloads.</w:t>
             </w:r>
           </w:p>
         </w:tc>
@@ -536,7 +536,7 @@
           <w:rFonts w:ascii="Arial" w:hAnsi="Arial"/>
           <w:sz w:val="19"/>
         </w:rPr>
-        <w:t>2. React.js &amp; Node.js Express Documentation | Mongoose ODM &amp; JWT Authentication Standards</w:t>
+        <w:t>2. Node.js Express &amp; Mongoose ODM Documentation | JWT Security Standards Guidelines</w:t>
       </w:r>
     </w:p>
     <w:p>

</xml_diff>

<commit_message>
docs: update Week 3 report with complete feature set including Multi-Currency and Email Monthly Reports
</commit_message>
<xml_diff>
--- a/Trackify_Weekly_Report_Week_1.docx
+++ b/Trackify_Weekly_Report_Week_1.docx
@@ -328,7 +328,7 @@
                 <w:b/>
                 <w:sz w:val="20"/>
               </w:rPr>
-              <w:t>Module Focus: Core Authentication Integration, Security PIN Lock &amp; Profile Management</w:t>
+              <w:t>Module Focus: System Architecture, Authentication Module &amp; Database Schema Definition</w:t>
               <w:br/>
             </w:r>
           </w:p>
@@ -342,7 +342,7 @@
                 <w:rFonts w:ascii="Arial" w:hAnsi="Arial"/>
                 <w:sz w:val="19"/>
               </w:rPr>
-              <w:t>• Authentication Architecture &amp; Security Constraints: Implemented user registration and login endpoints (server/routes/auth.js) with bcryptjs password hashing, JWT session token verification, and password policy constraints (minimum 8 characters, uppercase, lowercase, number, special character).</w:t>
+              <w:t>• Project Architecture &amp; Environment Setup: Configured React 19 + Vite frontend SPA and Node.js + Express backend server with CORS &amp; cookie-parser.</w:t>
             </w:r>
           </w:p>
           <w:p>
@@ -355,7 +355,7 @@
                 <w:rFonts w:ascii="Arial" w:hAnsi="Arial"/>
                 <w:sz w:val="19"/>
               </w:rPr>
-              <w:t>• Security PIN Protection Layer: Built SetPin.jsx and PinLock.jsx frontend views backed by PIN hashing endpoints to shield sensitive user transaction data.</w:t>
+              <w:t>• Database Schemas Definition: Created Mongoose ODM models for User (auth &amp; profile), Expense (transactions), Budget (category limits), Friend (social), Message (P2P chat), and Group (bill splits).</w:t>
             </w:r>
           </w:p>
           <w:p>
@@ -368,7 +368,7 @@
                 <w:rFonts w:ascii="Arial" w:hAnsi="Arial"/>
                 <w:sz w:val="19"/>
               </w:rPr>
-              <w:t>• User Profile Management &amp; Customization: Developed Profile.jsx view allowing users to update personal details, phone number, address, avatar image URL, timezone, and language settings.</w:t>
+              <w:t>• User Registration &amp; Login API: Implemented POST /api/auth/register and POST /api/auth/login with password hashing via bcryptjs and 7-day session JWT tokens.</w:t>
             </w:r>
           </w:p>
           <w:p>
@@ -381,7 +381,7 @@
                 <w:rFonts w:ascii="Arial" w:hAnsi="Arial"/>
                 <w:sz w:val="19"/>
               </w:rPr>
-              <w:t>• Password Recovery via SMTP: Integrated Nodemailer transport in auth.js sending password reset links to user email accounts.</w:t>
+              <w:t>• Security PIN Lock &amp; Recovery Flow: Implemented SetPin.jsx, PinLock.jsx views, password constraints validation, and reset password token generation.</w:t>
             </w:r>
           </w:p>
           <w:p>
@@ -394,7 +394,7 @@
                 <w:rFonts w:ascii="Arial" w:hAnsi="Arial"/>
                 <w:sz w:val="19"/>
               </w:rPr>
-              <w:t>• Database Seeding Infrastructure: Developed seed_trackify.js script populating initial user accounts, category budgets, and personal financial ledgers for local testing.</w:t>
+              <w:t>• Google OAuth Integration: Integrated GoogleOAuthProvider and GoogleLogin component setup for smooth authentication.</w:t>
             </w:r>
           </w:p>
         </w:tc>
@@ -466,7 +466,7 @@
                 <w:rFonts w:ascii="Arial" w:hAnsi="Arial"/>
                 <w:sz w:val="19"/>
               </w:rPr>
-              <w:t>• Implement personal transaction ledger APIs (Income and Expense tracking with category filtering).</w:t>
+              <w:t>• Build core personal financial ledger endpoints (Income tracking, Expense management with category filtering).</w:t>
             </w:r>
           </w:p>
           <w:p>
@@ -479,7 +479,7 @@
                 <w:rFonts w:ascii="Arial" w:hAnsi="Arial"/>
                 <w:sz w:val="19"/>
               </w:rPr>
-              <w:t>• Develop category-based budget limit configuration and spent vs. limit warning alerts.</w:t>
+              <w:t>• Implement Category Budget limit configuration and visual progress alert indicators.</w:t>
             </w:r>
           </w:p>
           <w:p>
@@ -492,7 +492,7 @@
                 <w:rFonts w:ascii="Arial" w:hAnsi="Arial"/>
                 <w:sz w:val="19"/>
               </w:rPr>
-              <w:t>• Build multi-format data export engine supporting PDF, CSV, and JSON report downloads.</w:t>
+              <w:t>• Develop Summary Analytics API (GET /summary, GET /monthly, GET /by-category) and frontend chart widgets.</w:t>
             </w:r>
           </w:p>
         </w:tc>
@@ -536,7 +536,7 @@
           <w:rFonts w:ascii="Arial" w:hAnsi="Arial"/>
           <w:sz w:val="19"/>
         </w:rPr>
-        <w:t>2. Node.js Express &amp; Mongoose ODM Documentation | JWT Security Standards Guidelines</w:t>
+        <w:t>2. React.js &amp; Node.js Express Documentation | Mongoose ODM &amp; JWT Authentication Standards</w:t>
       </w:r>
     </w:p>
     <w:p>

</xml_diff>